<commit_message>
docs: update laporan akhir EAI kelompok 11
</commit_message>
<xml_diff>
--- a/docs/Laporan-Akhir-EAI-kelompok 11.docx
+++ b/docs/Laporan-Akhir-EAI-kelompok 11.docx
@@ -1011,7 +1011,7 @@
         <w:pStyle w:val="BodyText0"/>
       </w:pPr>
       <w:r>
-        <w:t>#### 4.1 POS Service</w:t>
+        <w:t xml:space="preserve"> 4.1 POS Service</w:t>
       </w:r>
     </w:p>
     <w:p>
@@ -1266,7 +1266,7 @@
         <w:pStyle w:val="BodyText0"/>
       </w:pPr>
       <w:r>
-        <w:t>#### 4.2 Inventory Service</w:t>
+        <w:t xml:space="preserve"> 4.2 Inventory Service</w:t>
       </w:r>
     </w:p>
     <w:p>
@@ -3436,19 +3436,7 @@
           <w:rPr>
             <w:rStyle w:val="Hyperlink"/>
           </w:rPr>
-          <w:t>https://drive.google.com/drive/folders/1Ok6T</w:t>
-        </w:r>
-        <w:r>
-          <w:rPr>
-            <w:rStyle w:val="Hyperlink"/>
-          </w:rPr>
-          <w:t>N</w:t>
-        </w:r>
-        <w:r>
-          <w:rPr>
-            <w:rStyle w:val="Hyperlink"/>
-          </w:rPr>
-          <w:t>aEHZ71LXyiGk-ZsHFHORfu3rXHb?usp=sharing</w:t>
+          <w:t>https://drive.google.com/drive/folders/1Ok6TNaEHZ71LXyiGk-ZsHFHORfu3rXHb?usp=sharing</w:t>
         </w:r>
       </w:hyperlink>
     </w:p>

</xml_diff>